<commit_message>
Site updated: 2022-09-19 18:08:42
</commit_message>
<xml_diff>
--- a/treasure/download/经藏/经集部-433部/新建文件夹/佛说八大人觉经-后汉-安世高.docx
+++ b/treasure/download/经藏/经集部-433部/新建文件夹/佛说八大人觉经-后汉-安世高.docx
@@ -11,6 +11,7 @@
           <w:sz w:val="24"/>
           <w:szCs w:val="24"/>
           <w:shd w:val="pct15" w:color="auto" w:fill="FFFFFF"/>
+          <w:lang w:eastAsia="zh-CN"/>
         </w:rPr>
       </w:pPr>
       <w:r>
@@ -18,6 +19,7 @@
           <w:sz w:val="24"/>
           <w:szCs w:val="24"/>
           <w:shd w:val="pct15" w:color="auto" w:fill="FFFFFF"/>
+          <w:lang w:eastAsia="zh-CN"/>
         </w:rPr>
         <w:t>佛说八大人觉经</w:t>
       </w:r>
@@ -25,12 +27,14 @@
     <w:p>
       <w:pPr>
         <w:spacing w:after="0" w:line="240" w:lineRule="auto"/>
+        <w:ind w:firstLineChars="200" w:firstLine="480"/>
         <w:contextualSpacing/>
         <w:mirrorIndents/>
         <w:rPr>
           <w:sz w:val="24"/>
           <w:szCs w:val="24"/>
           <w:shd w:val="pct15" w:color="auto" w:fill="FFFFFF"/>
+          <w:lang w:eastAsia="zh-CN"/>
         </w:rPr>
       </w:pPr>
       <w:r>
@@ -38,14 +42,7 @@
           <w:sz w:val="24"/>
           <w:szCs w:val="24"/>
           <w:shd w:val="pct15" w:color="auto" w:fill="FFFFFF"/>
-        </w:rPr>
-        <w:t xml:space="preserve">　　</w:t>
-      </w:r>
-      <w:r>
-        <w:rPr>
-          <w:sz w:val="24"/>
-          <w:szCs w:val="24"/>
-          <w:shd w:val="pct15" w:color="auto" w:fill="FFFFFF"/>
+          <w:lang w:eastAsia="zh-CN"/>
         </w:rPr>
         <w:t>后汉安息国三藏安世高译</w:t>
       </w:r>
@@ -53,12 +50,14 @@
     <w:p>
       <w:pPr>
         <w:spacing w:after="0" w:line="240" w:lineRule="auto"/>
+        <w:ind w:firstLineChars="200" w:firstLine="480"/>
         <w:contextualSpacing/>
         <w:mirrorIndents/>
         <w:rPr>
           <w:sz w:val="24"/>
           <w:szCs w:val="24"/>
           <w:shd w:val="pct15" w:color="auto" w:fill="FFFFFF"/>
+          <w:lang w:eastAsia="zh-CN"/>
         </w:rPr>
       </w:pPr>
       <w:r>
@@ -66,19 +65,67 @@
           <w:sz w:val="24"/>
           <w:szCs w:val="24"/>
           <w:shd w:val="pct15" w:color="auto" w:fill="FFFFFF"/>
+          <w:lang w:eastAsia="zh-CN"/>
         </w:rPr>
-        <w:t xml:space="preserve">　　为佛弟子，常于昼夜，至心诵念，八大人觉：</w:t>
+        <w:t>为佛弟子</w:t>
+      </w:r>
+      <w:r>
+        <w:rPr>
+          <w:sz w:val="24"/>
+          <w:szCs w:val="24"/>
+          <w:shd w:val="pct15" w:color="auto" w:fill="FFFFFF"/>
+          <w:lang w:eastAsia="zh-CN"/>
+        </w:rPr>
+        <w:t>。</w:t>
+      </w:r>
+      <w:r>
+        <w:rPr>
+          <w:sz w:val="24"/>
+          <w:szCs w:val="24"/>
+          <w:shd w:val="pct15" w:color="auto" w:fill="FFFFFF"/>
+          <w:lang w:eastAsia="zh-CN"/>
+        </w:rPr>
+        <w:t>常于昼夜</w:t>
+      </w:r>
+      <w:r>
+        <w:rPr>
+          <w:sz w:val="24"/>
+          <w:szCs w:val="24"/>
+          <w:shd w:val="pct15" w:color="auto" w:fill="FFFFFF"/>
+          <w:lang w:eastAsia="zh-CN"/>
+        </w:rPr>
+        <w:t>。</w:t>
+      </w:r>
+      <w:r>
+        <w:rPr>
+          <w:sz w:val="24"/>
+          <w:szCs w:val="24"/>
+          <w:shd w:val="pct15" w:color="auto" w:fill="FFFFFF"/>
+          <w:lang w:eastAsia="zh-CN"/>
+        </w:rPr>
+        <w:t>至心诵念八大人觉</w:t>
+      </w:r>
+      <w:r>
+        <w:rPr>
+          <w:sz w:val="24"/>
+          <w:szCs w:val="24"/>
+          <w:shd w:val="pct15" w:color="auto" w:fill="FFFFFF"/>
+          <w:lang w:eastAsia="zh-CN"/>
+        </w:rPr>
+        <w:t>。</w:t>
       </w:r>
     </w:p>
     <w:p>
       <w:pPr>
         <w:spacing w:after="0" w:line="240" w:lineRule="auto"/>
+        <w:ind w:firstLineChars="200" w:firstLine="480"/>
         <w:contextualSpacing/>
         <w:mirrorIndents/>
         <w:rPr>
           <w:sz w:val="24"/>
           <w:szCs w:val="24"/>
           <w:shd w:val="pct15" w:color="auto" w:fill="FFFFFF"/>
+          <w:lang w:eastAsia="zh-CN"/>
         </w:rPr>
       </w:pPr>
       <w:r>
@@ -86,19 +133,184 @@
           <w:sz w:val="24"/>
           <w:szCs w:val="24"/>
           <w:shd w:val="pct15" w:color="auto" w:fill="FFFFFF"/>
+          <w:lang w:eastAsia="zh-CN"/>
         </w:rPr>
-        <w:t xml:space="preserve">　　第一觉悟：世间无常，国土危脆；四大苦空，五阴无我；生灭变异，虚伪无主；心是恶源，形为罪薮。如是观察，渐离生死。</w:t>
+        <w:t>第一觉悟</w:t>
+      </w:r>
+      <w:r>
+        <w:rPr>
+          <w:sz w:val="24"/>
+          <w:szCs w:val="24"/>
+          <w:shd w:val="pct15" w:color="auto" w:fill="FFFFFF"/>
+          <w:lang w:eastAsia="zh-CN"/>
+        </w:rPr>
+        <w:t>。</w:t>
+      </w:r>
+      <w:r>
+        <w:rPr>
+          <w:sz w:val="24"/>
+          <w:szCs w:val="24"/>
+          <w:shd w:val="pct15" w:color="auto" w:fill="FFFFFF"/>
+          <w:lang w:eastAsia="zh-CN"/>
+        </w:rPr>
+        <w:t>世间无常</w:t>
+      </w:r>
+      <w:r>
+        <w:rPr>
+          <w:sz w:val="24"/>
+          <w:szCs w:val="24"/>
+          <w:shd w:val="pct15" w:color="auto" w:fill="FFFFFF"/>
+          <w:lang w:eastAsia="zh-CN"/>
+        </w:rPr>
+        <w:t>。</w:t>
+      </w:r>
+      <w:r>
+        <w:rPr>
+          <w:sz w:val="24"/>
+          <w:szCs w:val="24"/>
+          <w:shd w:val="pct15" w:color="auto" w:fill="FFFFFF"/>
+          <w:lang w:eastAsia="zh-CN"/>
+        </w:rPr>
+        <w:t>国土危脆</w:t>
+      </w:r>
+      <w:r>
+        <w:rPr>
+          <w:sz w:val="24"/>
+          <w:szCs w:val="24"/>
+          <w:shd w:val="pct15" w:color="auto" w:fill="FFFFFF"/>
+          <w:lang w:eastAsia="zh-CN"/>
+        </w:rPr>
+        <w:t>。</w:t>
+      </w:r>
+      <w:r>
+        <w:rPr>
+          <w:sz w:val="24"/>
+          <w:szCs w:val="24"/>
+          <w:shd w:val="pct15" w:color="auto" w:fill="FFFFFF"/>
+          <w:lang w:eastAsia="zh-CN"/>
+        </w:rPr>
+        <w:t>四大苦空</w:t>
+      </w:r>
+      <w:r>
+        <w:rPr>
+          <w:sz w:val="24"/>
+          <w:szCs w:val="24"/>
+          <w:shd w:val="pct15" w:color="auto" w:fill="FFFFFF"/>
+          <w:lang w:eastAsia="zh-CN"/>
+        </w:rPr>
+        <w:t>。</w:t>
+      </w:r>
+      <w:r>
+        <w:rPr>
+          <w:sz w:val="24"/>
+          <w:szCs w:val="24"/>
+          <w:shd w:val="pct15" w:color="auto" w:fill="FFFFFF"/>
+          <w:lang w:eastAsia="zh-CN"/>
+        </w:rPr>
+        <w:t>五阴无我</w:t>
+      </w:r>
+      <w:r>
+        <w:rPr>
+          <w:sz w:val="24"/>
+          <w:szCs w:val="24"/>
+          <w:shd w:val="pct15" w:color="auto" w:fill="FFFFFF"/>
+          <w:lang w:eastAsia="zh-CN"/>
+        </w:rPr>
+        <w:t>。</w:t>
+      </w:r>
+      <w:r>
+        <w:rPr>
+          <w:sz w:val="24"/>
+          <w:szCs w:val="24"/>
+          <w:shd w:val="pct15" w:color="auto" w:fill="FFFFFF"/>
+          <w:lang w:eastAsia="zh-CN"/>
+        </w:rPr>
+        <w:t>生灭变异</w:t>
+      </w:r>
+      <w:r>
+        <w:rPr>
+          <w:sz w:val="24"/>
+          <w:szCs w:val="24"/>
+          <w:shd w:val="pct15" w:color="auto" w:fill="FFFFFF"/>
+          <w:lang w:eastAsia="zh-CN"/>
+        </w:rPr>
+        <w:t>。</w:t>
+      </w:r>
+      <w:r>
+        <w:rPr>
+          <w:sz w:val="24"/>
+          <w:szCs w:val="24"/>
+          <w:shd w:val="pct15" w:color="auto" w:fill="FFFFFF"/>
+          <w:lang w:eastAsia="zh-CN"/>
+        </w:rPr>
+        <w:t>虚伪无主</w:t>
+      </w:r>
+      <w:r>
+        <w:rPr>
+          <w:sz w:val="24"/>
+          <w:szCs w:val="24"/>
+          <w:shd w:val="pct15" w:color="auto" w:fill="FFFFFF"/>
+          <w:lang w:eastAsia="zh-CN"/>
+        </w:rPr>
+        <w:t>。</w:t>
+      </w:r>
+      <w:r>
+        <w:rPr>
+          <w:sz w:val="24"/>
+          <w:szCs w:val="24"/>
+          <w:shd w:val="pct15" w:color="auto" w:fill="FFFFFF"/>
+          <w:lang w:eastAsia="zh-CN"/>
+        </w:rPr>
+        <w:t>心是恶源</w:t>
+      </w:r>
+      <w:r>
+        <w:rPr>
+          <w:sz w:val="24"/>
+          <w:szCs w:val="24"/>
+          <w:shd w:val="pct15" w:color="auto" w:fill="FFFFFF"/>
+          <w:lang w:eastAsia="zh-CN"/>
+        </w:rPr>
+        <w:t>。</w:t>
+      </w:r>
+      <w:r>
+        <w:rPr>
+          <w:sz w:val="24"/>
+          <w:szCs w:val="24"/>
+          <w:shd w:val="pct15" w:color="auto" w:fill="FFFFFF"/>
+          <w:lang w:eastAsia="zh-CN"/>
+        </w:rPr>
+        <w:t>形为罪薮。如是观察</w:t>
+      </w:r>
+      <w:r>
+        <w:rPr>
+          <w:sz w:val="24"/>
+          <w:szCs w:val="24"/>
+          <w:shd w:val="pct15" w:color="auto" w:fill="FFFFFF"/>
+          <w:lang w:eastAsia="zh-CN"/>
+        </w:rPr>
+        <w:t>。</w:t>
+      </w:r>
+      <w:r>
+        <w:rPr>
+          <w:sz w:val="24"/>
+          <w:szCs w:val="24"/>
+          <w:shd w:val="pct15" w:color="auto" w:fill="FFFFFF"/>
+          <w:lang w:eastAsia="zh-CN"/>
+        </w:rPr>
+        <w:t>渐离生死。</w:t>
       </w:r>
     </w:p>
     <w:p>
       <w:pPr>
         <w:spacing w:after="0" w:line="240" w:lineRule="auto"/>
+        <w:ind w:firstLineChars="200" w:firstLine="480"/>
         <w:contextualSpacing/>
         <w:mirrorIndents/>
         <w:rPr>
           <w:sz w:val="24"/>
           <w:szCs w:val="24"/>
           <w:shd w:val="pct15" w:color="auto" w:fill="FFFFFF"/>
+          <w:lang w:eastAsia="zh-CN"/>
         </w:rPr>
       </w:pPr>
       <w:r>
@@ -106,19 +318,76 @@
           <w:sz w:val="24"/>
           <w:szCs w:val="24"/>
           <w:shd w:val="pct15" w:color="auto" w:fill="FFFFFF"/>
+          <w:lang w:eastAsia="zh-CN"/>
         </w:rPr>
-        <w:t xml:space="preserve">　　第二觉知：多欲为苦，生死疲劳，从贪欲起；少欲无为，身心自在。</w:t>
+        <w:t>第二觉知</w:t>
+      </w:r>
+      <w:r>
+        <w:rPr>
+          <w:sz w:val="24"/>
+          <w:szCs w:val="24"/>
+          <w:shd w:val="pct15" w:color="auto" w:fill="FFFFFF"/>
+          <w:lang w:eastAsia="zh-CN"/>
+        </w:rPr>
+        <w:t>。</w:t>
+      </w:r>
+      <w:r>
+        <w:rPr>
+          <w:sz w:val="24"/>
+          <w:szCs w:val="24"/>
+          <w:shd w:val="pct15" w:color="auto" w:fill="FFFFFF"/>
+          <w:lang w:eastAsia="zh-CN"/>
+        </w:rPr>
+        <w:t>多欲为苦</w:t>
+      </w:r>
+      <w:r>
+        <w:rPr>
+          <w:sz w:val="24"/>
+          <w:szCs w:val="24"/>
+          <w:shd w:val="pct15" w:color="auto" w:fill="FFFFFF"/>
+          <w:lang w:eastAsia="zh-CN"/>
+        </w:rPr>
+        <w:t>。</w:t>
+      </w:r>
+      <w:r>
+        <w:rPr>
+          <w:sz w:val="24"/>
+          <w:szCs w:val="24"/>
+          <w:shd w:val="pct15" w:color="auto" w:fill="FFFFFF"/>
+          <w:lang w:eastAsia="zh-CN"/>
+        </w:rPr>
+        <w:t>生死疲劳从贪欲起</w:t>
+      </w:r>
+      <w:r>
+        <w:rPr>
+          <w:sz w:val="24"/>
+          <w:szCs w:val="24"/>
+          <w:shd w:val="pct15" w:color="auto" w:fill="FFFFFF"/>
+          <w:lang w:eastAsia="zh-CN"/>
+        </w:rPr>
+        <w:t>。</w:t>
+      </w:r>
+      <w:r>
+        <w:rPr>
+          <w:sz w:val="24"/>
+          <w:szCs w:val="24"/>
+          <w:shd w:val="pct15" w:color="auto" w:fill="FFFFFF"/>
+          <w:lang w:eastAsia="zh-CN"/>
+        </w:rPr>
+        <w:t>少欲无为身心自在。</w:t>
       </w:r>
     </w:p>
     <w:p>
       <w:pPr>
         <w:spacing w:after="0" w:line="240" w:lineRule="auto"/>
+        <w:ind w:firstLineChars="200" w:firstLine="480"/>
         <w:contextualSpacing/>
         <w:mirrorIndents/>
         <w:rPr>
           <w:sz w:val="24"/>
           <w:szCs w:val="24"/>
           <w:shd w:val="pct15" w:color="auto" w:fill="FFFFFF"/>
+          <w:lang w:eastAsia="zh-CN"/>
         </w:rPr>
       </w:pPr>
       <w:r>
@@ -126,19 +395,149 @@
           <w:sz w:val="24"/>
           <w:szCs w:val="24"/>
           <w:shd w:val="pct15" w:color="auto" w:fill="FFFFFF"/>
+          <w:lang w:eastAsia="zh-CN"/>
         </w:rPr>
-        <w:t xml:space="preserve">　　第三觉知：心无厌足，唯得多求，增长罪恶；菩萨不尔，常念知足，安贫守道，唯慧是业。</w:t>
+        <w:t>第三觉知</w:t>
+      </w:r>
+      <w:r>
+        <w:rPr>
+          <w:sz w:val="24"/>
+          <w:szCs w:val="24"/>
+          <w:shd w:val="pct15" w:color="auto" w:fill="FFFFFF"/>
+          <w:lang w:eastAsia="zh-CN"/>
+        </w:rPr>
+        <w:t>。</w:t>
+      </w:r>
+      <w:r>
+        <w:rPr>
+          <w:sz w:val="24"/>
+          <w:szCs w:val="24"/>
+          <w:shd w:val="pct15" w:color="auto" w:fill="FFFFFF"/>
+          <w:lang w:eastAsia="zh-CN"/>
+        </w:rPr>
+        <w:t>心无厌足</w:t>
+      </w:r>
+      <w:r>
+        <w:rPr>
+          <w:sz w:val="24"/>
+          <w:szCs w:val="24"/>
+          <w:shd w:val="pct15" w:color="auto" w:fill="FFFFFF"/>
+          <w:lang w:eastAsia="zh-CN"/>
+        </w:rPr>
+        <w:t>。</w:t>
+      </w:r>
+      <w:r>
+        <w:rPr>
+          <w:sz w:val="24"/>
+          <w:szCs w:val="24"/>
+          <w:shd w:val="pct15" w:color="auto" w:fill="FFFFFF"/>
+          <w:lang w:eastAsia="zh-CN"/>
+        </w:rPr>
+        <w:t>唯得多求</w:t>
+      </w:r>
+      <w:r>
+        <w:rPr>
+          <w:rFonts w:hint="eastAsia"/>
+          <w:sz w:val="24"/>
+          <w:szCs w:val="24"/>
+          <w:shd w:val="pct15" w:color="auto" w:fill="FFFFFF"/>
+          <w:lang w:eastAsia="zh-CN"/>
+        </w:rPr>
+        <w:t>。</w:t>
+      </w:r>
+      <w:r>
+        <w:rPr>
+          <w:sz w:val="24"/>
+          <w:szCs w:val="24"/>
+          <w:shd w:val="pct15" w:color="auto" w:fill="FFFFFF"/>
+          <w:lang w:eastAsia="zh-CN"/>
+        </w:rPr>
+        <w:t>增长罪恶</w:t>
+      </w:r>
+      <w:r>
+        <w:rPr>
+          <w:sz w:val="24"/>
+          <w:szCs w:val="24"/>
+          <w:shd w:val="pct15" w:color="auto" w:fill="FFFFFF"/>
+          <w:lang w:eastAsia="zh-CN"/>
+        </w:rPr>
+        <w:t>。</w:t>
+      </w:r>
+      <w:r>
+        <w:rPr>
+          <w:sz w:val="24"/>
+          <w:szCs w:val="24"/>
+          <w:shd w:val="pct15" w:color="auto" w:fill="FFFFFF"/>
+          <w:lang w:eastAsia="zh-CN"/>
+        </w:rPr>
+        <w:t>菩萨不尔</w:t>
+      </w:r>
+      <w:r>
+        <w:rPr>
+          <w:sz w:val="24"/>
+          <w:szCs w:val="24"/>
+          <w:shd w:val="pct15" w:color="auto" w:fill="FFFFFF"/>
+          <w:lang w:eastAsia="zh-CN"/>
+        </w:rPr>
+        <w:t>。</w:t>
+      </w:r>
+      <w:r>
+        <w:rPr>
+          <w:sz w:val="24"/>
+          <w:szCs w:val="24"/>
+          <w:shd w:val="pct15" w:color="auto" w:fill="FFFFFF"/>
+          <w:lang w:eastAsia="zh-CN"/>
+        </w:rPr>
+        <w:t>常念知足</w:t>
+      </w:r>
+      <w:r>
+        <w:rPr>
+          <w:sz w:val="24"/>
+          <w:szCs w:val="24"/>
+          <w:shd w:val="pct15" w:color="auto" w:fill="FFFFFF"/>
+          <w:lang w:eastAsia="zh-CN"/>
+        </w:rPr>
+        <w:t>。</w:t>
+      </w:r>
+      <w:r>
+        <w:rPr>
+          <w:sz w:val="24"/>
+          <w:szCs w:val="24"/>
+          <w:shd w:val="pct15" w:color="auto" w:fill="FFFFFF"/>
+          <w:lang w:eastAsia="zh-CN"/>
+        </w:rPr>
+        <w:t>安贫守道</w:t>
+      </w:r>
+      <w:r>
+        <w:rPr>
+          <w:sz w:val="24"/>
+          <w:szCs w:val="24"/>
+          <w:shd w:val="pct15" w:color="auto" w:fill="FFFFFF"/>
+          <w:lang w:eastAsia="zh-CN"/>
+        </w:rPr>
+        <w:t>。</w:t>
+      </w:r>
+      <w:r>
+        <w:rPr>
+          <w:sz w:val="24"/>
+          <w:szCs w:val="24"/>
+          <w:shd w:val="pct15" w:color="auto" w:fill="FFFFFF"/>
+          <w:lang w:eastAsia="zh-CN"/>
+        </w:rPr>
+        <w:t>唯慧是业。</w:t>
       </w:r>
     </w:p>
     <w:p>
       <w:pPr>
         <w:spacing w:after="0" w:line="240" w:lineRule="auto"/>
+        <w:ind w:firstLineChars="200" w:firstLine="480"/>
         <w:contextualSpacing/>
         <w:mirrorIndents/>
         <w:rPr>
           <w:sz w:val="24"/>
           <w:szCs w:val="24"/>
           <w:shd w:val="pct15" w:color="auto" w:fill="FFFFFF"/>
+          <w:lang w:eastAsia="zh-CN"/>
         </w:rPr>
       </w:pPr>
       <w:r>
@@ -146,19 +545,112 @@
           <w:sz w:val="24"/>
           <w:szCs w:val="24"/>
           <w:shd w:val="pct15" w:color="auto" w:fill="FFFFFF"/>
+          <w:lang w:eastAsia="zh-CN"/>
         </w:rPr>
-        <w:t xml:space="preserve">　　第四觉知：懈怠坠落；常行精进，破烦恼恶，摧伏四魔，出阴界狱。</w:t>
+        <w:t>第四觉知</w:t>
+      </w:r>
+      <w:r>
+        <w:rPr>
+          <w:sz w:val="24"/>
+          <w:szCs w:val="24"/>
+          <w:shd w:val="pct15" w:color="auto" w:fill="FFFFFF"/>
+          <w:lang w:eastAsia="zh-CN"/>
+        </w:rPr>
+        <w:t>。</w:t>
+      </w:r>
+      <w:r>
+        <w:rPr>
+          <w:sz w:val="24"/>
+          <w:szCs w:val="24"/>
+          <w:shd w:val="pct15" w:color="auto" w:fill="FFFFFF"/>
+          <w:lang w:eastAsia="zh-CN"/>
+        </w:rPr>
+        <w:t>懈怠坠落</w:t>
+      </w:r>
+      <w:r>
+        <w:rPr>
+          <w:sz w:val="24"/>
+          <w:szCs w:val="24"/>
+          <w:shd w:val="pct15" w:color="auto" w:fill="FFFFFF"/>
+          <w:lang w:eastAsia="zh-CN"/>
+        </w:rPr>
+        <w:t>。</w:t>
+      </w:r>
+      <w:r>
+        <w:rPr>
+          <w:sz w:val="24"/>
+          <w:szCs w:val="24"/>
+          <w:shd w:val="pct15" w:color="auto" w:fill="FFFFFF"/>
+          <w:lang w:eastAsia="zh-CN"/>
+        </w:rPr>
+        <w:t>常行精进</w:t>
+      </w:r>
+      <w:r>
+        <w:rPr>
+          <w:sz w:val="24"/>
+          <w:szCs w:val="24"/>
+          <w:shd w:val="pct15" w:color="auto" w:fill="FFFFFF"/>
+          <w:lang w:eastAsia="zh-CN"/>
+        </w:rPr>
+        <w:t>。</w:t>
+      </w:r>
+      <w:r>
+        <w:rPr>
+          <w:sz w:val="24"/>
+          <w:szCs w:val="24"/>
+          <w:shd w:val="pct15" w:color="auto" w:fill="FFFFFF"/>
+          <w:lang w:eastAsia="zh-CN"/>
+        </w:rPr>
+        <w:t>破烦恼恶</w:t>
+      </w:r>
+      <w:r>
+        <w:rPr>
+          <w:sz w:val="24"/>
+          <w:szCs w:val="24"/>
+          <w:shd w:val="pct15" w:color="auto" w:fill="FFFFFF"/>
+          <w:lang w:eastAsia="zh-CN"/>
+        </w:rPr>
+        <w:t>。</w:t>
+      </w:r>
+      <w:r>
+        <w:rPr>
+          <w:sz w:val="24"/>
+          <w:szCs w:val="24"/>
+          <w:shd w:val="pct15" w:color="auto" w:fill="FFFFFF"/>
+          <w:lang w:eastAsia="zh-CN"/>
+        </w:rPr>
+        <w:t>摧伏四魔</w:t>
+      </w:r>
+      <w:r>
+        <w:rPr>
+          <w:sz w:val="24"/>
+          <w:szCs w:val="24"/>
+          <w:shd w:val="pct15" w:color="auto" w:fill="FFFFFF"/>
+          <w:lang w:eastAsia="zh-CN"/>
+        </w:rPr>
+        <w:t>。</w:t>
+      </w:r>
+      <w:r>
+        <w:rPr>
+          <w:sz w:val="24"/>
+          <w:szCs w:val="24"/>
+          <w:shd w:val="pct15" w:color="auto" w:fill="FFFFFF"/>
+          <w:lang w:eastAsia="zh-CN"/>
+        </w:rPr>
+        <w:t>出阴界狱。</w:t>
       </w:r>
     </w:p>
     <w:p>
       <w:pPr>
         <w:spacing w:after="0" w:line="240" w:lineRule="auto"/>
+        <w:ind w:firstLineChars="200" w:firstLine="480"/>
         <w:contextualSpacing/>
         <w:mirrorIndents/>
         <w:rPr>
           <w:sz w:val="24"/>
           <w:szCs w:val="24"/>
           <w:shd w:val="pct15" w:color="auto" w:fill="FFFFFF"/>
+          <w:lang w:eastAsia="zh-CN"/>
         </w:rPr>
       </w:pPr>
       <w:r>
@@ -166,19 +658,130 @@
           <w:sz w:val="24"/>
           <w:szCs w:val="24"/>
           <w:shd w:val="pct15" w:color="auto" w:fill="FFFFFF"/>
+          <w:lang w:eastAsia="zh-CN"/>
         </w:rPr>
-        <w:t xml:space="preserve">　　第五觉悟：愚痴生死。菩萨常念，广学多闻，增长智慧，成就辩才，教化一切，悉以大乐。</w:t>
+        <w:t>第五觉悟</w:t>
+      </w:r>
+      <w:r>
+        <w:rPr>
+          <w:sz w:val="24"/>
+          <w:szCs w:val="24"/>
+          <w:shd w:val="pct15" w:color="auto" w:fill="FFFFFF"/>
+          <w:lang w:eastAsia="zh-CN"/>
+        </w:rPr>
+        <w:t>。</w:t>
+      </w:r>
+      <w:r>
+        <w:rPr>
+          <w:sz w:val="24"/>
+          <w:szCs w:val="24"/>
+          <w:shd w:val="pct15" w:color="auto" w:fill="FFFFFF"/>
+          <w:lang w:eastAsia="zh-CN"/>
+        </w:rPr>
+        <w:t>愚痴生死。菩萨常念</w:t>
+      </w:r>
+      <w:r>
+        <w:rPr>
+          <w:sz w:val="24"/>
+          <w:szCs w:val="24"/>
+          <w:shd w:val="pct15" w:color="auto" w:fill="FFFFFF"/>
+          <w:lang w:eastAsia="zh-CN"/>
+        </w:rPr>
+        <w:t>。</w:t>
+      </w:r>
+      <w:r>
+        <w:rPr>
+          <w:sz w:val="24"/>
+          <w:szCs w:val="24"/>
+          <w:shd w:val="pct15" w:color="auto" w:fill="FFFFFF"/>
+          <w:lang w:eastAsia="zh-CN"/>
+        </w:rPr>
+        <w:t>广学多闻</w:t>
+      </w:r>
+      <w:r>
+        <w:rPr>
+          <w:sz w:val="24"/>
+          <w:szCs w:val="24"/>
+          <w:shd w:val="pct15" w:color="auto" w:fill="FFFFFF"/>
+          <w:lang w:eastAsia="zh-CN"/>
+        </w:rPr>
+        <w:t>。</w:t>
+      </w:r>
+      <w:r>
+        <w:rPr>
+          <w:sz w:val="24"/>
+          <w:szCs w:val="24"/>
+          <w:shd w:val="pct15" w:color="auto" w:fill="FFFFFF"/>
+          <w:lang w:eastAsia="zh-CN"/>
+        </w:rPr>
+        <w:t>增长智慧</w:t>
+      </w:r>
+      <w:r>
+        <w:rPr>
+          <w:sz w:val="24"/>
+          <w:szCs w:val="24"/>
+          <w:shd w:val="pct15" w:color="auto" w:fill="FFFFFF"/>
+          <w:lang w:eastAsia="zh-CN"/>
+        </w:rPr>
+        <w:t>。</w:t>
+      </w:r>
+      <w:r>
+        <w:rPr>
+          <w:sz w:val="24"/>
+          <w:szCs w:val="24"/>
+          <w:shd w:val="pct15" w:color="auto" w:fill="FFFFFF"/>
+          <w:lang w:eastAsia="zh-CN"/>
+        </w:rPr>
+        <w:t>成就辩才</w:t>
+      </w:r>
+      <w:r>
+        <w:rPr>
+          <w:sz w:val="24"/>
+          <w:szCs w:val="24"/>
+          <w:shd w:val="pct15" w:color="auto" w:fill="FFFFFF"/>
+          <w:lang w:eastAsia="zh-CN"/>
+        </w:rPr>
+        <w:t>。</w:t>
+      </w:r>
+      <w:r>
+        <w:rPr>
+          <w:sz w:val="24"/>
+          <w:szCs w:val="24"/>
+          <w:shd w:val="pct15" w:color="auto" w:fill="FFFFFF"/>
+          <w:lang w:eastAsia="zh-CN"/>
+        </w:rPr>
+        <w:t>教化一切</w:t>
+      </w:r>
+      <w:r>
+        <w:rPr>
+          <w:sz w:val="24"/>
+          <w:szCs w:val="24"/>
+          <w:shd w:val="pct15" w:color="auto" w:fill="FFFFFF"/>
+          <w:lang w:eastAsia="zh-CN"/>
+        </w:rPr>
+        <w:t>。</w:t>
+      </w:r>
+      <w:r>
+        <w:rPr>
+          <w:sz w:val="24"/>
+          <w:szCs w:val="24"/>
+          <w:shd w:val="pct15" w:color="auto" w:fill="FFFFFF"/>
+          <w:lang w:eastAsia="zh-CN"/>
+        </w:rPr>
+        <w:t>悉以大乐。</w:t>
       </w:r>
     </w:p>
     <w:p>
       <w:pPr>
         <w:spacing w:after="0" w:line="240" w:lineRule="auto"/>
+        <w:ind w:firstLineChars="200" w:firstLine="480"/>
         <w:contextualSpacing/>
         <w:mirrorIndents/>
         <w:rPr>
           <w:sz w:val="24"/>
           <w:szCs w:val="24"/>
           <w:shd w:val="pct15" w:color="auto" w:fill="FFFFFF"/>
+          <w:lang w:eastAsia="zh-CN"/>
         </w:rPr>
       </w:pPr>
       <w:r>
@@ -186,19 +789,58 @@
           <w:sz w:val="24"/>
           <w:szCs w:val="24"/>
           <w:shd w:val="pct15" w:color="auto" w:fill="FFFFFF"/>
+          <w:lang w:eastAsia="zh-CN"/>
         </w:rPr>
-        <w:t xml:space="preserve">　　第六觉知：贫苦多怨，横结恶缘。菩萨布施，等念冤亲，不念旧恶，不憎恶人。</w:t>
+        <w:t>第六觉知</w:t>
+      </w:r>
+      <w:r>
+        <w:rPr>
+          <w:sz w:val="24"/>
+          <w:szCs w:val="24"/>
+          <w:shd w:val="pct15" w:color="auto" w:fill="FFFFFF"/>
+          <w:lang w:eastAsia="zh-CN"/>
+        </w:rPr>
+        <w:t>。</w:t>
+      </w:r>
+      <w:r>
+        <w:rPr>
+          <w:sz w:val="24"/>
+          <w:szCs w:val="24"/>
+          <w:shd w:val="pct15" w:color="auto" w:fill="FFFFFF"/>
+          <w:lang w:eastAsia="zh-CN"/>
+        </w:rPr>
+        <w:t>贫苦多怨横结恶缘。菩萨布施等念冤亲</w:t>
+      </w:r>
+      <w:r>
+        <w:rPr>
+          <w:sz w:val="24"/>
+          <w:szCs w:val="24"/>
+          <w:shd w:val="pct15" w:color="auto" w:fill="FFFFFF"/>
+          <w:lang w:eastAsia="zh-CN"/>
+        </w:rPr>
+        <w:t>。</w:t>
+      </w:r>
+      <w:r>
+        <w:rPr>
+          <w:sz w:val="24"/>
+          <w:szCs w:val="24"/>
+          <w:shd w:val="pct15" w:color="auto" w:fill="FFFFFF"/>
+          <w:lang w:eastAsia="zh-CN"/>
+        </w:rPr>
+        <w:t>不念旧恶不憎恶人。</w:t>
       </w:r>
     </w:p>
     <w:p>
       <w:pPr>
         <w:spacing w:after="0" w:line="240" w:lineRule="auto"/>
+        <w:ind w:firstLineChars="200" w:firstLine="480"/>
         <w:contextualSpacing/>
         <w:mirrorIndents/>
         <w:rPr>
           <w:sz w:val="24"/>
           <w:szCs w:val="24"/>
           <w:shd w:val="pct15" w:color="auto" w:fill="FFFFFF"/>
+          <w:lang w:eastAsia="zh-CN"/>
         </w:rPr>
       </w:pPr>
       <w:r>
@@ -206,8 +848,54 @@
           <w:sz w:val="24"/>
           <w:szCs w:val="24"/>
           <w:shd w:val="pct15" w:color="auto" w:fill="FFFFFF"/>
+          <w:lang w:eastAsia="zh-CN"/>
         </w:rPr>
-        <w:t xml:space="preserve">　　第七觉悟：五欲过患。虽为俗人，不染世乐；</w:t>
+        <w:t>第七觉悟</w:t>
+      </w:r>
+      <w:r>
+        <w:rPr>
+          <w:sz w:val="24"/>
+          <w:szCs w:val="24"/>
+          <w:shd w:val="pct15" w:color="auto" w:fill="FFFFFF"/>
+          <w:lang w:eastAsia="zh-CN"/>
+        </w:rPr>
+        <w:t>。</w:t>
+      </w:r>
+      <w:r>
+        <w:rPr>
+          <w:sz w:val="24"/>
+          <w:szCs w:val="24"/>
+          <w:shd w:val="pct15" w:color="auto" w:fill="FFFFFF"/>
+          <w:lang w:eastAsia="zh-CN"/>
+        </w:rPr>
+        <w:t>五欲过患。虽为俗人</w:t>
+      </w:r>
+      <w:r>
+        <w:rPr>
+          <w:sz w:val="24"/>
+          <w:szCs w:val="24"/>
+          <w:shd w:val="pct15" w:color="auto" w:fill="FFFFFF"/>
+          <w:lang w:eastAsia="zh-CN"/>
+        </w:rPr>
+        <w:t>。</w:t>
+      </w:r>
+      <w:r>
+        <w:rPr>
+          <w:sz w:val="24"/>
+          <w:szCs w:val="24"/>
+          <w:shd w:val="pct15" w:color="auto" w:fill="FFFFFF"/>
+          <w:lang w:eastAsia="zh-CN"/>
+        </w:rPr>
+        <w:t>不染世乐</w:t>
+      </w:r>
+      <w:r>
+        <w:rPr>
+          <w:sz w:val="24"/>
+          <w:szCs w:val="24"/>
+          <w:shd w:val="pct15" w:color="auto" w:fill="FFFFFF"/>
+          <w:lang w:eastAsia="zh-CN"/>
+        </w:rPr>
+        <w:t>。</w:t>
       </w:r>
       <w:r>
         <w:rPr>
@@ -219,6 +907,33 @@
         </w:rPr>
         <w:t>常</w:t>
       </w:r>
+      <w:r>
+        <w:rPr>
+          <w:sz w:val="24"/>
+          <w:szCs w:val="24"/>
+          <w:shd w:val="pct15" w:color="auto" w:fill="FFFFFF"/>
+          <w:lang w:eastAsia="zh-CN"/>
+        </w:rPr>
+        <w:t>念三衣瓶钵法器</w:t>
+      </w:r>
+      <w:r>
+        <w:rPr>
+          <w:sz w:val="24"/>
+          <w:szCs w:val="24"/>
+          <w:shd w:val="pct15" w:color="auto" w:fill="FFFFFF"/>
+          <w:lang w:eastAsia="zh-CN"/>
+        </w:rPr>
+        <w:t>。</w:t>
+      </w:r>
+      <w:r>
+        <w:rPr>
+          <w:sz w:val="24"/>
+          <w:szCs w:val="24"/>
+          <w:shd w:val="pct15" w:color="auto" w:fill="FFFFFF"/>
+          <w:lang w:eastAsia="zh-CN"/>
+        </w:rPr>
+        <w:t>志愿出</w:t>
+      </w:r>
       <w:bookmarkStart w:id="0" w:name="_GoBack"/>
       <w:bookmarkEnd w:id="0"/>
       <w:r>
@@ -226,19 +941,40 @@
           <w:sz w:val="24"/>
           <w:szCs w:val="24"/>
           <w:shd w:val="pct15" w:color="auto" w:fill="FFFFFF"/>
+          <w:lang w:eastAsia="zh-CN"/>
         </w:rPr>
-        <w:t>念三衣，瓶钵法器；志愿出家，守道清白；梵行高远，慈悲一切。</w:t>
+        <w:t>家守道清白</w:t>
+      </w:r>
+      <w:r>
+        <w:rPr>
+          <w:sz w:val="24"/>
+          <w:szCs w:val="24"/>
+          <w:shd w:val="pct15" w:color="auto" w:fill="FFFFFF"/>
+          <w:lang w:eastAsia="zh-CN"/>
+        </w:rPr>
+        <w:t>。</w:t>
+      </w:r>
+      <w:r>
+        <w:rPr>
+          <w:sz w:val="24"/>
+          <w:szCs w:val="24"/>
+          <w:shd w:val="pct15" w:color="auto" w:fill="FFFFFF"/>
+          <w:lang w:eastAsia="zh-CN"/>
+        </w:rPr>
+        <w:t>梵行高远慈悲一切。</w:t>
       </w:r>
     </w:p>
     <w:p>
       <w:pPr>
         <w:spacing w:after="0" w:line="240" w:lineRule="auto"/>
+        <w:ind w:firstLineChars="200" w:firstLine="480"/>
         <w:contextualSpacing/>
         <w:mirrorIndents/>
         <w:rPr>
           <w:sz w:val="24"/>
           <w:szCs w:val="24"/>
           <w:shd w:val="pct15" w:color="auto" w:fill="FFFFFF"/>
+          <w:lang w:eastAsia="zh-CN"/>
         </w:rPr>
       </w:pPr>
       <w:r>
@@ -246,19 +982,76 @@
           <w:sz w:val="24"/>
           <w:szCs w:val="24"/>
           <w:shd w:val="pct15" w:color="auto" w:fill="FFFFFF"/>
+          <w:lang w:eastAsia="zh-CN"/>
         </w:rPr>
-        <w:t xml:space="preserve">　　第八觉知：生死炽然，苦恼无量。发大乘心，普济一切；愿代众生，受无量苦；令诸众生，毕竟大乐。</w:t>
+        <w:t>第八觉知</w:t>
+      </w:r>
+      <w:r>
+        <w:rPr>
+          <w:sz w:val="24"/>
+          <w:szCs w:val="24"/>
+          <w:shd w:val="pct15" w:color="auto" w:fill="FFFFFF"/>
+          <w:lang w:eastAsia="zh-CN"/>
+        </w:rPr>
+        <w:t>。</w:t>
+      </w:r>
+      <w:r>
+        <w:rPr>
+          <w:sz w:val="24"/>
+          <w:szCs w:val="24"/>
+          <w:shd w:val="pct15" w:color="auto" w:fill="FFFFFF"/>
+          <w:lang w:eastAsia="zh-CN"/>
+        </w:rPr>
+        <w:t>生死炽然苦恼无量。发大乘心普济一切</w:t>
+      </w:r>
+      <w:r>
+        <w:rPr>
+          <w:sz w:val="24"/>
+          <w:szCs w:val="24"/>
+          <w:shd w:val="pct15" w:color="auto" w:fill="FFFFFF"/>
+          <w:lang w:eastAsia="zh-CN"/>
+        </w:rPr>
+        <w:t>。</w:t>
+      </w:r>
+      <w:r>
+        <w:rPr>
+          <w:sz w:val="24"/>
+          <w:szCs w:val="24"/>
+          <w:shd w:val="pct15" w:color="auto" w:fill="FFFFFF"/>
+          <w:lang w:eastAsia="zh-CN"/>
+        </w:rPr>
+        <w:t>愿代众生受无量苦</w:t>
+      </w:r>
+      <w:r>
+        <w:rPr>
+          <w:sz w:val="24"/>
+          <w:szCs w:val="24"/>
+          <w:shd w:val="pct15" w:color="auto" w:fill="FFFFFF"/>
+          <w:lang w:eastAsia="zh-CN"/>
+        </w:rPr>
+        <w:t>。</w:t>
+      </w:r>
+      <w:r>
+        <w:rPr>
+          <w:sz w:val="24"/>
+          <w:szCs w:val="24"/>
+          <w:shd w:val="pct15" w:color="auto" w:fill="FFFFFF"/>
+          <w:lang w:eastAsia="zh-CN"/>
+        </w:rPr>
+        <w:t>令诸众生毕竟大乐。</w:t>
       </w:r>
     </w:p>
     <w:p>
       <w:pPr>
         <w:spacing w:after="0" w:line="240" w:lineRule="auto"/>
+        <w:ind w:firstLineChars="200" w:firstLine="480"/>
         <w:contextualSpacing/>
         <w:mirrorIndents/>
         <w:rPr>
           <w:sz w:val="24"/>
           <w:szCs w:val="24"/>
           <w:shd w:val="pct15" w:color="auto" w:fill="FFFFFF"/>
+          <w:lang w:eastAsia="zh-CN"/>
         </w:rPr>
       </w:pPr>
       <w:r>
@@ -266,27 +1059,112 @@
           <w:sz w:val="24"/>
           <w:szCs w:val="24"/>
           <w:shd w:val="pct15" w:color="auto" w:fill="FFFFFF"/>
+          <w:lang w:eastAsia="zh-CN"/>
         </w:rPr>
-        <w:t xml:space="preserve">　　如此八事，乃是诸佛菩萨大人之所觉悟。精进行道，慈悲修慧，乘法身船，至涅槃岸；复还生死，度脱众生。以前八事，开导一切，令诸众生，觉生死苦，舍离五欲，</w:t>
+        <w:t>如此八事</w:t>
       </w:r>
       <w:r>
         <w:rPr>
           <w:sz w:val="24"/>
           <w:szCs w:val="24"/>
           <w:shd w:val="pct15" w:color="auto" w:fill="FFFFFF"/>
+          <w:lang w:eastAsia="zh-CN"/>
         </w:rPr>
-        <w:t>修心圣道。</w:t>
+        <w:t>。</w:t>
+      </w:r>
+      <w:r>
+        <w:rPr>
+          <w:sz w:val="24"/>
+          <w:szCs w:val="24"/>
+          <w:shd w:val="pct15" w:color="auto" w:fill="FFFFFF"/>
+          <w:lang w:eastAsia="zh-CN"/>
+        </w:rPr>
+        <w:t>乃是诸佛菩萨大人之所觉悟。精进行道慈悲修慧</w:t>
+      </w:r>
+      <w:r>
+        <w:rPr>
+          <w:sz w:val="24"/>
+          <w:szCs w:val="24"/>
+          <w:shd w:val="pct15" w:color="auto" w:fill="FFFFFF"/>
+          <w:lang w:eastAsia="zh-CN"/>
+        </w:rPr>
+        <w:t>。</w:t>
+      </w:r>
+      <w:r>
+        <w:rPr>
+          <w:sz w:val="24"/>
+          <w:szCs w:val="24"/>
+          <w:shd w:val="pct15" w:color="auto" w:fill="FFFFFF"/>
+          <w:lang w:eastAsia="zh-CN"/>
+        </w:rPr>
+        <w:t>乘法身船至涅槃岸</w:t>
+      </w:r>
+      <w:r>
+        <w:rPr>
+          <w:sz w:val="24"/>
+          <w:szCs w:val="24"/>
+          <w:shd w:val="pct15" w:color="auto" w:fill="FFFFFF"/>
+          <w:lang w:eastAsia="zh-CN"/>
+        </w:rPr>
+        <w:t>。</w:t>
+      </w:r>
+      <w:r>
+        <w:rPr>
+          <w:sz w:val="24"/>
+          <w:szCs w:val="24"/>
+          <w:shd w:val="pct15" w:color="auto" w:fill="FFFFFF"/>
+          <w:lang w:eastAsia="zh-CN"/>
+        </w:rPr>
+        <w:t>复还生死度脱众生。以前八事开导一切</w:t>
+      </w:r>
+      <w:r>
+        <w:rPr>
+          <w:sz w:val="24"/>
+          <w:szCs w:val="24"/>
+          <w:shd w:val="pct15" w:color="auto" w:fill="FFFFFF"/>
+          <w:lang w:eastAsia="zh-CN"/>
+        </w:rPr>
+        <w:t>。</w:t>
+      </w:r>
+      <w:r>
+        <w:rPr>
+          <w:sz w:val="24"/>
+          <w:szCs w:val="24"/>
+          <w:shd w:val="pct15" w:color="auto" w:fill="FFFFFF"/>
+          <w:lang w:eastAsia="zh-CN"/>
+        </w:rPr>
+        <w:t>令诸众生觉生死苦</w:t>
+      </w:r>
+      <w:r>
+        <w:rPr>
+          <w:sz w:val="24"/>
+          <w:szCs w:val="24"/>
+          <w:shd w:val="pct15" w:color="auto" w:fill="FFFFFF"/>
+          <w:lang w:eastAsia="zh-CN"/>
+        </w:rPr>
+        <w:t>。</w:t>
+      </w:r>
+      <w:r>
+        <w:rPr>
+          <w:sz w:val="24"/>
+          <w:szCs w:val="24"/>
+          <w:shd w:val="pct15" w:color="auto" w:fill="FFFFFF"/>
+          <w:lang w:eastAsia="zh-CN"/>
+        </w:rPr>
+        <w:t>舍离五欲修心圣道。</w:t>
       </w:r>
     </w:p>
     <w:p>
       <w:pPr>
         <w:spacing w:after="0" w:line="240" w:lineRule="auto"/>
+        <w:ind w:firstLineChars="200" w:firstLine="480"/>
         <w:contextualSpacing/>
         <w:mirrorIndents/>
         <w:rPr>
           <w:sz w:val="24"/>
           <w:szCs w:val="24"/>
           <w:shd w:val="pct15" w:color="auto" w:fill="FFFFFF"/>
+          <w:lang w:eastAsia="zh-CN"/>
         </w:rPr>
       </w:pPr>
       <w:r>
@@ -294,36 +1172,63 @@
           <w:sz w:val="24"/>
           <w:szCs w:val="24"/>
           <w:shd w:val="pct15" w:color="auto" w:fill="FFFFFF"/>
+          <w:lang w:eastAsia="zh-CN"/>
         </w:rPr>
-        <w:t xml:space="preserve">　　若佛弟子，诵此八事，于念念中，灭无量罪；进趣菩提，速登正觉；永断生死，常住快乐。</w:t>
-      </w:r>
-    </w:p>
-    <w:p>
-      <w:pPr>
-        <w:spacing w:after="0" w:line="240" w:lineRule="auto"/>
-        <w:contextualSpacing/>
-        <w:mirrorIndents/>
-        <w:rPr>
-          <w:sz w:val="24"/>
-          <w:szCs w:val="24"/>
-          <w:shd w:val="pct15" w:color="auto" w:fill="FFFFFF"/>
-        </w:rPr>
-      </w:pPr>
-      <w:r>
-        <w:rPr>
-          <w:sz w:val="24"/>
-          <w:szCs w:val="24"/>
-          <w:shd w:val="pct15" w:color="auto" w:fill="FFFFFF"/>
-        </w:rPr>
-        <w:t xml:space="preserve">　　</w:t>
+        <w:t>若佛弟子诵此八事</w:t>
       </w:r>
       <w:r>
         <w:rPr>
           <w:sz w:val="24"/>
           <w:szCs w:val="24"/>
           <w:shd w:val="pct15" w:color="auto" w:fill="FFFFFF"/>
+          <w:lang w:eastAsia="zh-CN"/>
         </w:rPr>
-        <w:t>佛说八大人觉经</w:t>
+        <w:t>。</w:t>
+      </w:r>
+      <w:r>
+        <w:rPr>
+          <w:sz w:val="24"/>
+          <w:szCs w:val="24"/>
+          <w:shd w:val="pct15" w:color="auto" w:fill="FFFFFF"/>
+          <w:lang w:eastAsia="zh-CN"/>
+        </w:rPr>
+        <w:t>于念念中灭无量罪</w:t>
+      </w:r>
+      <w:r>
+        <w:rPr>
+          <w:sz w:val="24"/>
+          <w:szCs w:val="24"/>
+          <w:shd w:val="pct15" w:color="auto" w:fill="FFFFFF"/>
+          <w:lang w:eastAsia="zh-CN"/>
+        </w:rPr>
+        <w:t>。</w:t>
+      </w:r>
+      <w:r>
+        <w:rPr>
+          <w:sz w:val="24"/>
+          <w:szCs w:val="24"/>
+          <w:shd w:val="pct15" w:color="auto" w:fill="FFFFFF"/>
+          <w:lang w:eastAsia="zh-CN"/>
+        </w:rPr>
+        <w:t>进趣菩提速登正觉</w:t>
+      </w:r>
+      <w:r>
+        <w:rPr>
+          <w:sz w:val="24"/>
+          <w:szCs w:val="24"/>
+          <w:shd w:val="pct15" w:color="auto" w:fill="FFFFFF"/>
+          <w:lang w:eastAsia="zh-CN"/>
+        </w:rPr>
+        <w:t>。</w:t>
+      </w:r>
+      <w:r>
+        <w:rPr>
+          <w:sz w:val="24"/>
+          <w:szCs w:val="24"/>
+          <w:shd w:val="pct15" w:color="auto" w:fill="FFFFFF"/>
+          <w:lang w:eastAsia="zh-CN"/>
+        </w:rPr>
+        <w:t>永断生死常住快乐。</w:t>
       </w:r>
     </w:p>
     <w:sectPr>
@@ -12245,7 +13150,7 @@
 </file>
 
 <file path=customXml/itemProps1.xml><?xml version="1.0" encoding="utf-8"?>
-<ds:datastoreItem xmlns:ds="http://schemas.openxmlformats.org/officeDocument/2006/customXml" ds:itemID="{0F9F4212-CD24-4DF7-9678-D1B0DD08E514}">
+<ds:datastoreItem xmlns:ds="http://schemas.openxmlformats.org/officeDocument/2006/customXml" ds:itemID="{B5470F4D-6823-4861-954E-A879C30B52A3}">
   <ds:schemaRefs>
     <ds:schemaRef ds:uri="http://schemas.openxmlformats.org/officeDocument/2006/bibliography"/>
   </ds:schemaRefs>

</xml_diff>